<commit_message>
Update repository links to HariKrishnaKR1/loss-and-damage
</commit_message>
<xml_diff>
--- a/docs/Thesis.docx
+++ b/docs/Thesis.docx
@@ -394,7 +394,10 @@
         <w:t>Date:</w:t>
       </w:r>
       <w:r>
-        <w:t xml:space="preserve">                                                                                                               </w:t>
+        <w:t xml:space="preserve">  05 / 05 / 2026</w:t>
+      </w:r>
+      <w:r>
+        <w:t xml:space="preserve">                                                                                            </w:t>
       </w:r>
       <w:r>
         <w:t>K R Hari Krishna</w:t>
@@ -558,7 +561,12 @@
     </w:p>
     <w:p>
       <w:r>
-        <w:t xml:space="preserve">I acknowledge the support of my friends and batchmates. Research requires teamwork, and no significant work happens alone. Having my friends act as peer reviewers and writers significantly boosted my morale when conducting my research. Finally, I must thank my family, especially my parents, for their </w:t>
+        <w:t xml:space="preserve">I acknowledge the support of my friends and batchmates. Research requires teamwork, and no significant work happens alone. Having my friends act as peer reviewers and writers significantly boosted my morale when conducting my research. </w:t>
+      </w:r>
+    </w:p>
+    <w:p>
+      <w:r>
+        <w:t xml:space="preserve">Finally, I must thank my family, especially my parents, for their </w:t>
       </w:r>
       <w:r>
         <w:t>unwavering</w:t>
@@ -12202,77 +12210,33 @@
     </w:p>
     <w:p>
       <w:r>
-        <w:t xml:space="preserve">Loss and damage (L&amp;D) was central to climate talks for more than two decades before being formally set up in the Warsaw International Mechanism (2013) and Article 8 of the Paris Agreement (2015). However, neither of these milestones led to a clear definition of L&amp;D, nor an understanding of what it involves or who is accountable for it. This paper argues that this lack of clarity is deliberate and that it </w:t>
-      </w:r>
-      <w:r>
-        <w:t>arises from difficulties due to interests</w:t>
-      </w:r>
-      <w:r>
-        <w:t xml:space="preserve"> </w:t>
-      </w:r>
-      <w:r>
-        <w:t>of</w:t>
-      </w:r>
-      <w:r>
-        <w:t xml:space="preserve"> developed and developing nations </w:t>
-      </w:r>
-      <w:r>
-        <w:t>with</w:t>
-      </w:r>
-      <w:r>
-        <w:t xml:space="preserve"> language </w:t>
-      </w:r>
-      <w:r>
-        <w:t>as</w:t>
-      </w:r>
-      <w:r>
-        <w:t xml:space="preserve"> the main tool </w:t>
-      </w:r>
-      <w:r>
-        <w:t>for their</w:t>
-      </w:r>
-      <w:r>
-        <w:t xml:space="preserve"> political </w:t>
-      </w:r>
-      <w:r>
-        <w:t>demands</w:t>
-      </w:r>
-      <w:r>
-        <w:t>.</w:t>
-      </w:r>
-    </w:p>
-    <w:p>
-      <w:r>
-        <w:t xml:space="preserve">Using Fairclough's three-part model for critical discourse analysis, this thesis examines </w:t>
-      </w:r>
-      <w:r>
-        <w:t xml:space="preserve">L&amp;D alongside major decisions such as </w:t>
-      </w:r>
-      <w:r>
-        <w:t xml:space="preserve">Decision 2/CP.19 and how </w:t>
-      </w:r>
-      <w:r>
-        <w:t>those decisions</w:t>
-      </w:r>
-      <w:r>
-        <w:t xml:space="preserve"> alter the power dynamic </w:t>
-      </w:r>
-      <w:r>
-        <w:t>of policies under</w:t>
-      </w:r>
-      <w:r>
-        <w:t xml:space="preserve"> the UNFCCC. Th</w:t>
-      </w:r>
-      <w:r>
-        <w:t xml:space="preserve">is involves the analysis of </w:t>
-      </w:r>
-      <w:r>
-        <w:t>specific word choices within the text itself, the negotiating positions and history of the institutions that created it, and the wider set of discourses it belongs to.</w:t>
-      </w:r>
-    </w:p>
-    <w:p>
-      <w:r>
-        <w:t>Developing nations used the demand for compensation as a tool to make rich countries formally recognise L&amp;D as a separate issue from adaptation. Developed countries countered this by focusing on disaster risk reduction and questioning the science of climate change attribution to avoid liability. The agreed-upon language in 2/CP.19 is deliberately vague, representing a pause rather than an agreement. While the push for direct compensation lessened after the Paris Agreement, the fundamental call for climate justice remains.</w:t>
+        <w:t>Developing countries suffered $320 billion in climate losses in 2024 and projections reach $1.7 trillion annually by 2050. The international community has negotiated for three decades yet the only dedicated global mechanism held just $828 million as of late 2025. This sum is less than 0.2 per cent of the annual need and the gap shows no sign of closing under the current design.</w:t>
+      </w:r>
+    </w:p>
+    <w:p>
+      <w:r>
+        <w:t>This study argues that this gap is structural and built into the legal architecture of the fund itself. Negotiators systematically removed liability language from every major UNFCCC agreement between 1991 and 2023. This dynamic is named destructive ambiguity, where textual vagueness enables consensus but destroys the capacity to generate predictable finance.</w:t>
+      </w:r>
+    </w:p>
+    <w:p>
+      <w:r>
+        <w:t>Drawing on Fairclough's critical discourse analysis, this study examined UNFCCC decision texts and negotiating documents from 1991 to 2024. Analysis revealed how liability-linked terms declined while cooperation language rose and how mandatory financial proposals were rejected or diluted before reaching a final text.</w:t>
+      </w:r>
+    </w:p>
+    <w:p>
+      <w:r>
+        <w:t xml:space="preserve">The findings confirm three things about the current financing architecture. First, exclusion of liability translated directly into clauses that forbid mandatory targets and leave contribution volumes entirely to donor discretion. Second, the free-rider problem </w:t>
+      </w:r>
+      <w:r>
+        <w:t xml:space="preserve">has become </w:t>
+      </w:r>
+      <w:r>
+        <w:t xml:space="preserve">a designed feature of a voluntary model without enforcement mechanisms or contribution formulas. Third, solidarity levies offer the most viable path to predictable revenue without triggering the liability red lines that developed nations have enforced since 1991. </w:t>
+      </w:r>
+    </w:p>
+    <w:p>
+      <w:r>
+        <w:t>The upcoming World Bank review is the immediate legal opportunity to redesign the fund's revenue architecture through COP decisions as no improvement in governance can close the gap between the billions needed. Thus, addressing loss and damage requires changing the legal basis for contributions and the clock is already running.</w:t>
       </w:r>
     </w:p>
     <w:p>
@@ -12284,49 +12248,10 @@
         <w:t>Keywords:</w:t>
       </w:r>
       <w:r>
-        <w:t xml:space="preserve"> loss and damage</w:t>
-      </w:r>
-      <w:r>
-        <w:t>,</w:t>
-      </w:r>
-      <w:r>
-        <w:t xml:space="preserve"> climate negotiations</w:t>
-      </w:r>
-      <w:r>
-        <w:t>,</w:t>
-      </w:r>
-      <w:r>
-        <w:t xml:space="preserve"> critical discourse analysis</w:t>
-      </w:r>
-      <w:r>
-        <w:t xml:space="preserve">, </w:t>
-      </w:r>
-      <w:r>
-        <w:t>Fund for Responding to Loss and Damage</w:t>
-      </w:r>
-      <w:r>
-        <w:t xml:space="preserve">, </w:t>
-      </w:r>
-      <w:r>
-        <w:t>Warsaw International Mechanism</w:t>
-      </w:r>
-      <w:r>
-        <w:t>,</w:t>
-      </w:r>
-      <w:r>
-        <w:t xml:space="preserve"> compensation</w:t>
-      </w:r>
-      <w:r>
-        <w:t>,</w:t>
-      </w:r>
-      <w:r>
-        <w:t xml:space="preserve"> climate justice</w:t>
-      </w:r>
-      <w:r>
-        <w:t>,</w:t>
-      </w:r>
-      <w:r>
-        <w:t xml:space="preserve"> UNFCCC</w:t>
+        <w:t xml:space="preserve"> </w:t>
+      </w:r>
+      <w:r>
+        <w:t>loss and damage, UNFCCC, Fund for Responding to Loss and Damage, critical discourse analysis, destructive ambiguity, liability, climate finance, constructive ambiguity, fiscal authority, voluntary contributions</w:t>
       </w:r>
       <w:r>
         <w:br w:type="page"/>
@@ -12412,43 +12337,7 @@
     </w:p>
     <w:p>
       <w:r>
-        <w:t xml:space="preserve">Historical data from EM-DAT, compiled by Delforge and team (2025), confirm the cumulative toll of these climate hazards. Between 01 January 2000 and 14 April 2026, the world experienced over 9,803 distinct extreme weather events, resulting in over </w:t>
-      </w:r>
-      <w:r>
-        <w:rPr>
-          <w:b/>
-          <w:bCs/>
-        </w:rPr>
-        <w:t>1,571,197</w:t>
-      </w:r>
-      <w:r>
-        <w:t xml:space="preserve"> deaths globally, with direct, inflation-adjusted economic losses reaching nearly $4.8 trillion. Storms caused the greatest economic destruction, accounting for </w:t>
-      </w:r>
-      <w:r>
-        <w:rPr>
-          <w:b/>
-          <w:bCs/>
-        </w:rPr>
-        <w:t>49.6 per cent</w:t>
-      </w:r>
-      <w:r>
-        <w:t xml:space="preserve"> of total losses at $2.4 trillion, followed by floods, which accounted for </w:t>
-      </w:r>
-      <w:r>
-        <w:rPr>
-          <w:b/>
-          <w:bCs/>
-        </w:rPr>
-        <w:t>21 per cent</w:t>
-      </w:r>
-      <w:r>
-        <w:t xml:space="preserve"> at $1.1 trillion.</w:t>
-      </w:r>
-      <w:r>
-        <w:t xml:space="preserve"> </w:t>
-      </w:r>
-      <w:r>
-        <w:t>These figures show the scale and concentration of losses, reinforcing the need for governance frameworks that can address both cumulative and event-specific Loss and Damage.</w:t>
+        <w:t>Historical data from EM-DAT, compiled by Delforge and team (2025), confirm the cumulative toll of these climate hazards. Between 01 January 2000 and 14 April 2026, the world experienced over 9,803 distinct extreme weather events, resulting in over 1,571,197 deaths globally, with direct, inflation-adjusted economic losses reaching nearly $4.8 trillion. Storms caused the greatest economic destruction, accounting for 49.6 per cent of total losses at $2.4 trillion, followed by floods, which accounted for 21 per cent at $1.1 trillion. These figures show the scale and concentration of losses, reinforcing the need for governance frameworks that can address both cumulative and event-specific Loss and Damage.</w:t>
       </w:r>
     </w:p>
     <w:p>
@@ -13623,16 +13512,7 @@
         <w:spacing w:after="0"/>
       </w:pPr>
       <w:r>
-        <w:t xml:space="preserve">Analysing the </w:t>
-      </w:r>
-      <w:r>
-        <w:t xml:space="preserve">range of financial instruments proposed in the UNFCCC negotiations vs. those included in the final form of the </w:t>
-      </w:r>
-      <w:r>
-        <w:t>FRLD</w:t>
-      </w:r>
-      <w:r>
-        <w:t>, and the amount pledged in each case.</w:t>
+        <w:t>Analysing the range of financial instruments proposed in the UNFCCC negotiations vs. those included in the final form of the FRLD, and the amount pledged in each case.</w:t>
       </w:r>
     </w:p>
     <w:p>
@@ -14367,7 +14247,13 @@
         <w:t xml:space="preserve"> a condition in which ambiguity enables institutional agreement but simultaneously undermines the framework’s capacity to generate enforceable obligations and adequate finance.</w:t>
       </w:r>
       <w:r>
-        <w:t xml:space="preserve"> The ambiguity that allows treaties to exist also prevents them from raising capital, laying the foundation for </w:t>
+        <w:t xml:space="preserve"> Th</w:t>
+      </w:r>
+      <w:r>
+        <w:t>is</w:t>
+      </w:r>
+      <w:r>
+        <w:t xml:space="preserve"> ambiguity allows treaties to exist also prevents them from raising capital, laying the foundation for </w:t>
       </w:r>
       <w:r>
         <w:rPr>
@@ -42151,7 +42037,36 @@
       </w:r>
       <w:bookmarkEnd w:id="425"/>
     </w:p>
-    <w:p/>
+    <w:p>
+      <w:r>
+        <w:t>This repository serves as the archive for all projects, data, and academic documents linked to the thesis </w:t>
+      </w:r>
+      <w:r>
+        <w:rPr>
+          <w:b/>
+          <w:bCs/>
+        </w:rPr>
+        <w:t>"Tracking the Evolution of the Loss and Damage Financing Architecture under the UNFCCC"</w:t>
+      </w:r>
+      <w:r>
+        <w:t xml:space="preserve">. </w:t>
+      </w:r>
+    </w:p>
+    <w:p>
+      <w:r>
+        <w:rPr>
+          <w:b/>
+          <w:bCs/>
+        </w:rPr>
+        <w:t>Website:</w:t>
+      </w:r>
+      <w:r>
+        <w:t xml:space="preserve"> https://github.com/HariKrishnaKR1/</w:t>
+      </w:r>
+      <w:r>
+        <w:t>loss-and-damage</w:t>
+      </w:r>
+    </w:p>
     <w:sectPr>
       <w:pgSz w:w="11906" w:h="16838"/>
       <w:pgMar w:top="1440" w:right="1440" w:bottom="1440" w:left="1440" w:header="720" w:footer="720" w:gutter="0"/>

</xml_diff>